<commit_message>
docs(sop): 階段一驗收 SOP v1.1 · 反映本輪 PDR + LIFF + emoji cleanup 變更
對照 commit da118d8 / b71a342 / d4815a5 · 更新台灣福祉階段一驗收 SOP：

步驟 12 (LIFF 內看日報) 拆兩情境 · 明確驗收 empty state
- 情境 A · AI 已整理 · 驗收 items 卡片 + 編輯區下方 live preview
- 情境 B · 尚未整理 · 驗收「已私訊 N 則」+ 原始訊息 list + 重新生成流程

步驟 13 (送出) 補完整 preview 說明
- confirm dialog 非 native prompt · 內含主管將收到的完整 preview
- 主管 LINE 通知格式無 emoji 開頭

Web 端說明補
- employee default 登入直接進「我的日報」(role gate)
- pane-hdr 分區工具列 (查看日期 + 當日操作)
- 編輯區下方 live preview

Checklist 從 4 項擴到 10 項 · 對應新驗收點 (12a/12b/12c/13a/14/15)
版本標頭 v1.0 → v1.1 · 附 v1.1 修訂摘要
產出 docx / html 一併 regen (PDF 需 weasyprint 未裝 · 略過)
</commit_message>
<xml_diff>
--- a/docs/customer/台灣福祉_階段一驗收SOP.docx
+++ b/docs/customer/台灣福祉_階段一驗收SOP.docx
@@ -155,7 +155,7 @@
         <w:rPr>
           <w:rFonts w:hint="eastAsia"/>
         </w:rPr>
-        <w:t xml:space="preserve">：v1.0（2026-07-23）｜對應：階段一開發（2026-07）｜aiproot</w:t>
+        <w:t xml:space="preserve">：v1.1（2026-07-23）｜對應：階段一開發（2026-07）｜aiproot</w:t>
       </w:r>
       <w:r>
         <w:t xml:space="preserve"> </w:t>
@@ -165,6 +165,140 @@
           <w:rFonts w:hint="eastAsia"/>
         </w:rPr>
         <w:t xml:space="preserve">交付</w:t>
+      </w:r>
+    </w:p>
+    <w:p>
+      <w:pPr>
+        <w:pStyle w:val="BlockText"/>
+      </w:pPr>
+      <w:r>
+        <w:rPr>
+          <w:b/>
+          <w:bCs/>
+        </w:rPr>
+        <w:t xml:space="preserve">v1.1 </w:t>
+      </w:r>
+      <w:r>
+        <w:rPr>
+          <w:rFonts w:hint="eastAsia"/>
+          <w:b/>
+          <w:bCs/>
+        </w:rPr>
+        <w:t xml:space="preserve">修訂</w:t>
+      </w:r>
+      <w:r>
+        <w:rPr>
+          <w:rFonts w:hint="eastAsia"/>
+        </w:rPr>
+        <w:t xml:space="preserve">：新增「日報</w:t>
+      </w:r>
+      <w:r>
+        <w:t xml:space="preserve"> empty state </w:t>
+      </w:r>
+      <w:r>
+        <w:rPr>
+          <w:rFonts w:hint="eastAsia"/>
+        </w:rPr>
+        <w:t xml:space="preserve">顯已私訊</w:t>
+      </w:r>
+      <w:r>
+        <w:t xml:space="preserve"> N </w:t>
+      </w:r>
+      <w:r>
+        <w:rPr>
+          <w:rFonts w:hint="eastAsia"/>
+        </w:rPr>
+        <w:t xml:space="preserve">則</w:t>
+      </w:r>
+      <w:r>
+        <w:t xml:space="preserve"> + </w:t>
+      </w:r>
+      <w:r>
+        <w:rPr>
+          <w:rFonts w:hint="eastAsia"/>
+        </w:rPr>
+        <w:t xml:space="preserve">原始訊息</w:t>
+      </w:r>
+      <w:r>
+        <w:t xml:space="preserve"> </w:t>
+      </w:r>
+      <w:r>
+        <w:rPr>
+          <w:rFonts w:hint="eastAsia"/>
+        </w:rPr>
+        <w:t xml:space="preserve">list」、「送出前完整</w:t>
+      </w:r>
+      <w:r>
+        <w:t xml:space="preserve"> </w:t>
+      </w:r>
+      <w:r>
+        <w:rPr>
+          <w:rFonts w:hint="eastAsia"/>
+        </w:rPr>
+        <w:t xml:space="preserve">preview（LIFF</w:t>
+      </w:r>
+      <w:r>
+        <w:t xml:space="preserve"> confirm dialog + Web </w:t>
+      </w:r>
+      <w:r>
+        <w:rPr>
+          <w:rFonts w:hint="eastAsia"/>
+        </w:rPr>
+        <w:t xml:space="preserve">編輯區下方</w:t>
+      </w:r>
+      <w:r>
+        <w:t xml:space="preserve"> live </w:t>
+      </w:r>
+      <w:r>
+        <w:rPr>
+          <w:rFonts w:hint="eastAsia"/>
+        </w:rPr>
+        <w:t xml:space="preserve">preview）」、「Web</w:t>
+      </w:r>
+      <w:r>
+        <w:t xml:space="preserve"> </w:t>
+      </w:r>
+      <w:r>
+        <w:rPr>
+          <w:rFonts w:hint="eastAsia"/>
+        </w:rPr>
+        <w:t xml:space="preserve">我的日報</w:t>
+      </w:r>
+      <w:r>
+        <w:t xml:space="preserve"> pane-hdr </w:t>
+      </w:r>
+      <w:r>
+        <w:rPr>
+          <w:rFonts w:hint="eastAsia"/>
+        </w:rPr>
+        <w:t xml:space="preserve">分區工具列（查看日期</w:t>
+      </w:r>
+      <w:r>
+        <w:t xml:space="preserve"> + </w:t>
+      </w:r>
+      <w:r>
+        <w:rPr>
+          <w:rFonts w:hint="eastAsia"/>
+        </w:rPr>
+        <w:t xml:space="preserve">當日操作）」、「移除</w:t>
+      </w:r>
+      <w:r>
+        <w:t xml:space="preserve"> UI </w:t>
+      </w:r>
+      <w:r>
+        <w:rPr>
+          <w:rFonts w:hint="eastAsia"/>
+        </w:rPr>
+        <w:t xml:space="preserve">圖示型</w:t>
+      </w:r>
+      <w:r>
+        <w:t xml:space="preserve"> emoji」、「Web employee default landing = </w:t>
+      </w:r>
+      <w:r>
+        <w:rPr>
+          <w:rFonts w:hint="eastAsia"/>
+        </w:rPr>
+        <w:t xml:space="preserve">我的日報」等驗收項</w:t>
       </w:r>
     </w:p>
     <w:p>
@@ -6729,7 +6863,7 @@
         <w:rPr>
           <w:rStyle w:val="VerbatimChar"/>
         </w:rPr>
-        <w:t xml:space="preserve">[ 📋 </w:t>
+        <w:t xml:space="preserve">[ </w:t>
       </w:r>
       <w:r>
         <w:rPr>
@@ -6821,15 +6955,6 @@
         </w:rPr>
         <w:t xml:space="preserve">小網頁顯示今日日報</w:t>
       </w:r>
-      <w:r>
-        <w:t xml:space="preserve"> · AI </w:t>
-      </w:r>
-      <w:r>
-        <w:rPr>
-          <w:rFonts w:hint="eastAsia"/>
-        </w:rPr>
-        <w:t xml:space="preserve">已整理項目</w:t>
-      </w:r>
     </w:p>
     <w:p>
       <w:pPr>
@@ -6841,13 +6966,65 @@
           <w:b/>
           <w:bCs/>
         </w:rPr>
-        <w:t xml:space="preserve">應該看到</w:t>
-      </w:r>
-      <w:r>
-        <w:rPr>
-          <w:rFonts w:hint="eastAsia"/>
-        </w:rPr>
-        <w:t xml:space="preserve">：</w:t>
+        <w:t xml:space="preserve">兩種可能情境</w:t>
+      </w:r>
+      <w:r>
+        <w:rPr>
+          <w:rFonts w:hint="eastAsia"/>
+        </w:rPr>
+        <w:t xml:space="preserve">（依當日訊息狀態）：</w:t>
+      </w:r>
+    </w:p>
+    <w:p>
+      <w:pPr>
+        <w:pStyle w:val="BodyText"/>
+      </w:pPr>
+      <w:r>
+        <w:rPr>
+          <w:rFonts w:hint="eastAsia"/>
+          <w:b/>
+          <w:bCs/>
+        </w:rPr>
+        <w:t xml:space="preserve">情境</w:t>
+      </w:r>
+      <w:r>
+        <w:rPr>
+          <w:b/>
+          <w:bCs/>
+        </w:rPr>
+        <w:t xml:space="preserve"> A · AI </w:t>
+      </w:r>
+      <w:r>
+        <w:rPr>
+          <w:rFonts w:hint="eastAsia"/>
+          <w:b/>
+          <w:bCs/>
+        </w:rPr>
+        <w:t xml:space="preserve">已整理</w:t>
+      </w:r>
+      <w:r>
+        <w:rPr>
+          <w:rFonts w:hint="eastAsia"/>
+        </w:rPr>
+        <w:t xml:space="preserve">（scheduler</w:t>
+      </w:r>
+      <w:r>
+        <w:t xml:space="preserve"> </w:t>
+      </w:r>
+      <w:r>
+        <w:rPr>
+          <w:rFonts w:hint="eastAsia"/>
+        </w:rPr>
+        <w:t xml:space="preserve">已跑</w:t>
+      </w:r>
+      <w:r>
+        <w:t xml:space="preserve"> / </w:t>
+      </w:r>
+      <w:r>
+        <w:rPr>
+          <w:rFonts w:hint="eastAsia"/>
+        </w:rPr>
+        <w:t xml:space="preserve">之前手動生成過）：</w:t>
       </w:r>
     </w:p>
     <w:p>
@@ -6859,9 +7036,6 @@
         </w:numPr>
       </w:pPr>
       <w:r>
-        <w:t xml:space="preserve">✅ </w:t>
-      </w:r>
-      <w:r>
         <w:rPr>
           <w:rFonts w:hint="eastAsia"/>
         </w:rPr>
@@ -6894,9 +7068,6 @@
           <w:numId w:val="1040"/>
         </w:numPr>
       </w:pPr>
-      <w:r>
-        <w:t xml:space="preserve">✅ </w:t>
-      </w:r>
       <w:r>
         <w:rPr>
           <w:rFonts w:hint="eastAsia"/>
@@ -7018,9 +7189,6 @@
         </w:numPr>
       </w:pPr>
       <w:r>
-        <w:t xml:space="preserve">✅ </w:t>
-      </w:r>
-      <w:r>
         <w:rPr>
           <w:rFonts w:hint="eastAsia"/>
         </w:rPr>
@@ -7036,9 +7204,6 @@
         </w:numPr>
       </w:pPr>
       <w:r>
-        <w:t xml:space="preserve">✅ </w:t>
-      </w:r>
-      <w:r>
         <w:rPr>
           <w:rFonts w:hint="eastAsia"/>
         </w:rPr>
@@ -7063,8 +7228,52 @@
         </w:numPr>
       </w:pPr>
       <w:r>
-        <w:t xml:space="preserve">✅ </w:t>
-      </w:r>
+        <w:rPr>
+          <w:rFonts w:hint="eastAsia"/>
+          <w:b/>
+          <w:bCs/>
+        </w:rPr>
+        <w:t xml:space="preserve">編輯區下方即時「主管將看到</w:t>
+      </w:r>
+      <w:r>
+        <w:rPr>
+          <w:b/>
+          <w:bCs/>
+        </w:rPr>
+        <w:t xml:space="preserve"> · </w:t>
+      </w:r>
+      <w:r>
+        <w:rPr>
+          <w:rFonts w:hint="eastAsia"/>
+          <w:b/>
+          <w:bCs/>
+        </w:rPr>
+        <w:t xml:space="preserve">預覽」</w:t>
+      </w:r>
+      <w:r>
+        <w:rPr>
+          <w:rFonts w:hint="eastAsia"/>
+        </w:rPr>
+        <w:t xml:space="preserve">（隨編輯</w:t>
+      </w:r>
+      <w:r>
+        <w:t xml:space="preserve"> live update · </w:t>
+      </w:r>
+      <w:r>
+        <w:rPr>
+          <w:rFonts w:hint="eastAsia"/>
+        </w:rPr>
+        <w:t xml:space="preserve">送出前可看整份報告樣式）</w:t>
+      </w:r>
+    </w:p>
+    <w:p>
+      <w:pPr>
+        <w:pStyle w:val="Compact"/>
+        <w:numPr>
+          <w:ilvl w:val="0"/>
+          <w:numId w:val="1040"/>
+        </w:numPr>
+      </w:pPr>
       <w:r>
         <w:rPr>
           <w:rFonts w:hint="eastAsia"/>
@@ -7091,7 +7300,275 @@
           <w:b/>
           <w:bCs/>
         </w:rPr>
-        <w:t xml:space="preserve">若看到「今日尚未有記錄」</w:t>
+        <w:t xml:space="preserve">情境</w:t>
+      </w:r>
+      <w:r>
+        <w:rPr>
+          <w:b/>
+          <w:bCs/>
+        </w:rPr>
+        <w:t xml:space="preserve"> B · </w:t>
+      </w:r>
+      <w:r>
+        <w:rPr>
+          <w:rFonts w:hint="eastAsia"/>
+          <w:b/>
+          <w:bCs/>
+        </w:rPr>
+        <w:t xml:space="preserve">尚未整理</w:t>
+      </w:r>
+      <w:r>
+        <w:rPr>
+          <w:rFonts w:hint="eastAsia"/>
+        </w:rPr>
+        <w:t xml:space="preserve">（今日有私訊</w:t>
+      </w:r>
+      <w:r>
+        <w:t xml:space="preserve"> · </w:t>
+      </w:r>
+      <w:r>
+        <w:rPr>
+          <w:rFonts w:hint="eastAsia"/>
+        </w:rPr>
+        <w:t xml:space="preserve">但</w:t>
+      </w:r>
+      <w:r>
+        <w:t xml:space="preserve"> AI </w:t>
+      </w:r>
+      <w:r>
+        <w:rPr>
+          <w:rFonts w:hint="eastAsia"/>
+        </w:rPr>
+        <w:t xml:space="preserve">還沒跑）：</w:t>
+      </w:r>
+    </w:p>
+    <w:p>
+      <w:pPr>
+        <w:pStyle w:val="Compact"/>
+        <w:numPr>
+          <w:ilvl w:val="0"/>
+          <w:numId w:val="1042"/>
+        </w:numPr>
+      </w:pPr>
+      <w:r>
+        <w:rPr>
+          <w:rFonts w:hint="eastAsia"/>
+        </w:rPr>
+        <w:t xml:space="preserve">頂部橘色</w:t>
+      </w:r>
+      <w:r>
+        <w:t xml:space="preserve"> status </w:t>
+      </w:r>
+      <w:r>
+        <w:rPr>
+          <w:rFonts w:hint="eastAsia"/>
+        </w:rPr>
+        <w:t xml:space="preserve">bar：「你今日已私訊</w:t>
+      </w:r>
+      <w:r>
+        <w:t xml:space="preserve"> bot</w:t>
+      </w:r>
+      <w:r>
+        <w:t xml:space="preserve"> </w:t>
+      </w:r>
+      <w:r>
+        <w:rPr>
+          <w:b/>
+          <w:bCs/>
+        </w:rPr>
+        <w:t xml:space="preserve">N</w:t>
+      </w:r>
+      <w:r>
+        <w:t xml:space="preserve"> </w:t>
+      </w:r>
+      <w:r>
+        <w:rPr>
+          <w:rFonts w:hint="eastAsia"/>
+        </w:rPr>
+        <w:t xml:space="preserve">則</w:t>
+      </w:r>
+      <w:r>
+        <w:t xml:space="preserve"> · AI </w:t>
+      </w:r>
+      <w:r>
+        <w:rPr>
+          <w:rFonts w:hint="eastAsia"/>
+        </w:rPr>
+        <w:t xml:space="preserve">尚未整理</w:t>
+      </w:r>
+      <w:r>
+        <w:t xml:space="preserve"> · </w:t>
+      </w:r>
+      <w:r>
+        <w:rPr>
+          <w:rFonts w:hint="eastAsia"/>
+        </w:rPr>
+        <w:t xml:space="preserve">按下方『重新生成』」</w:t>
+      </w:r>
+    </w:p>
+    <w:p>
+      <w:pPr>
+        <w:pStyle w:val="Compact"/>
+        <w:numPr>
+          <w:ilvl w:val="0"/>
+          <w:numId w:val="1042"/>
+        </w:numPr>
+      </w:pPr>
+      <w:r>
+        <w:rPr>
+          <w:rFonts w:hint="eastAsia"/>
+        </w:rPr>
+        <w:t xml:space="preserve">中間顯「今日已私訊</w:t>
+      </w:r>
+      <w:r>
+        <w:t xml:space="preserve"> </w:t>
+      </w:r>
+      <w:r>
+        <w:rPr>
+          <w:b/>
+          <w:bCs/>
+        </w:rPr>
+        <w:t xml:space="preserve">N</w:t>
+      </w:r>
+      <w:r>
+        <w:t xml:space="preserve"> </w:t>
+      </w:r>
+      <w:r>
+        <w:rPr>
+          <w:rFonts w:hint="eastAsia"/>
+        </w:rPr>
+        <w:t xml:space="preserve">則」</w:t>
+      </w:r>
+    </w:p>
+    <w:p>
+      <w:pPr>
+        <w:pStyle w:val="Compact"/>
+        <w:numPr>
+          <w:ilvl w:val="0"/>
+          <w:numId w:val="1042"/>
+        </w:numPr>
+      </w:pPr>
+      <w:r>
+        <w:rPr>
+          <w:rFonts w:hint="eastAsia"/>
+        </w:rPr>
+        <w:t xml:space="preserve">下方展開</w:t>
+      </w:r>
+      <w:r>
+        <w:t xml:space="preserve"> </w:t>
+      </w:r>
+      <w:r>
+        <w:rPr>
+          <w:b/>
+          <w:bCs/>
+        </w:rPr>
+        <w:t xml:space="preserve">bot </w:t>
+      </w:r>
+      <w:r>
+        <w:rPr>
+          <w:rFonts w:hint="eastAsia"/>
+          <w:b/>
+          <w:bCs/>
+        </w:rPr>
+        <w:t xml:space="preserve">收到的原始訊息</w:t>
+      </w:r>
+      <w:r>
+        <w:rPr>
+          <w:b/>
+          <w:bCs/>
+        </w:rPr>
+        <w:t xml:space="preserve"> list</w:t>
+      </w:r>
+      <w:r>
+        <w:rPr>
+          <w:rFonts w:hint="eastAsia"/>
+        </w:rPr>
+        <w:t xml:space="preserve">（依時間排序</w:t>
+      </w:r>
+      <w:r>
+        <w:t xml:space="preserve"> · Alice </w:t>
+      </w:r>
+      <w:r>
+        <w:rPr>
+          <w:rFonts w:hint="eastAsia"/>
+        </w:rPr>
+        <w:t xml:space="preserve">可確認</w:t>
+      </w:r>
+      <w:r>
+        <w:t xml:space="preserve"> bot </w:t>
+      </w:r>
+      <w:r>
+        <w:rPr>
+          <w:rFonts w:hint="eastAsia"/>
+        </w:rPr>
+        <w:t xml:space="preserve">有收到什麼）</w:t>
+      </w:r>
+    </w:p>
+    <w:p>
+      <w:pPr>
+        <w:pStyle w:val="Compact"/>
+        <w:numPr>
+          <w:ilvl w:val="0"/>
+          <w:numId w:val="1042"/>
+        </w:numPr>
+      </w:pPr>
+      <w:r>
+        <w:rPr>
+          <w:rFonts w:hint="eastAsia"/>
+        </w:rPr>
+        <w:t xml:space="preserve">按「重新生成」→</w:t>
+      </w:r>
+      <w:r>
+        <w:t xml:space="preserve"> 5–10 </w:t>
+      </w:r>
+      <w:r>
+        <w:rPr>
+          <w:rFonts w:hint="eastAsia"/>
+        </w:rPr>
+        <w:t xml:space="preserve">秒後</w:t>
+      </w:r>
+      <w:r>
+        <w:t xml:space="preserve"> AI </w:t>
+      </w:r>
+      <w:r>
+        <w:rPr>
+          <w:rFonts w:hint="eastAsia"/>
+        </w:rPr>
+        <w:t xml:space="preserve">整理完</w:t>
+      </w:r>
+      <w:r>
+        <w:t xml:space="preserve"> → </w:t>
+      </w:r>
+      <w:r>
+        <w:rPr>
+          <w:rFonts w:hint="eastAsia"/>
+        </w:rPr>
+        <w:t xml:space="preserve">頁面</w:t>
+      </w:r>
+      <w:r>
+        <w:t xml:space="preserve"> refresh </w:t>
+      </w:r>
+      <w:r>
+        <w:rPr>
+          <w:rFonts w:hint="eastAsia"/>
+        </w:rPr>
+        <w:t xml:space="preserve">到情境</w:t>
+      </w:r>
+      <w:r>
+        <w:t xml:space="preserve"> A</w:t>
+      </w:r>
+    </w:p>
+    <w:p>
+      <w:pPr>
+        <w:pStyle w:val="FirstParagraph"/>
+      </w:pPr>
+      <w:r>
+        <w:rPr>
+          <w:rFonts w:hint="eastAsia"/>
+          <w:b/>
+          <w:bCs/>
+        </w:rPr>
+        <w:t xml:space="preserve">若看到「還沒開始記錄」</w:t>
       </w:r>
       <w:r>
         <w:rPr>
@@ -7105,7 +7582,7 @@
         <w:pStyle w:val="Compact"/>
         <w:numPr>
           <w:ilvl w:val="0"/>
-          <w:numId w:val="1042"/>
+          <w:numId w:val="1043"/>
         </w:numPr>
       </w:pPr>
       <w:r>
@@ -7124,15 +7601,24 @@
         <w:rPr>
           <w:rFonts w:hint="eastAsia"/>
         </w:rPr>
-        <w:t xml:space="preserve">或都是貼圖沒文字</w:t>
-      </w:r>
-    </w:p>
-    <w:p>
-      <w:pPr>
-        <w:pStyle w:val="Compact"/>
-        <w:numPr>
-          <w:ilvl w:val="0"/>
-          <w:numId w:val="1042"/>
+        <w:t xml:space="preserve">或都是貼圖</w:t>
+      </w:r>
+      <w:r>
+        <w:t xml:space="preserve"> / </w:t>
+      </w:r>
+      <w:r>
+        <w:rPr>
+          <w:rFonts w:hint="eastAsia"/>
+        </w:rPr>
+        <w:t xml:space="preserve">圖片沒文字</w:t>
+      </w:r>
+    </w:p>
+    <w:p>
+      <w:pPr>
+        <w:pStyle w:val="Compact"/>
+        <w:numPr>
+          <w:ilvl w:val="0"/>
+          <w:numId w:val="1043"/>
         </w:numPr>
       </w:pPr>
       <w:r>
@@ -7214,7 +7700,7 @@
         <w:pStyle w:val="Compact"/>
         <w:numPr>
           <w:ilvl w:val="0"/>
-          <w:numId w:val="1043"/>
+          <w:numId w:val="1044"/>
         </w:numPr>
       </w:pPr>
       <w:r>
@@ -7334,7 +7820,7 @@
         <w:pStyle w:val="Compact"/>
         <w:numPr>
           <w:ilvl w:val="0"/>
-          <w:numId w:val="1044"/>
+          <w:numId w:val="1045"/>
         </w:numPr>
       </w:pPr>
       <w:r>
@@ -7376,7 +7862,7 @@
         <w:pStyle w:val="Compact"/>
         <w:numPr>
           <w:ilvl w:val="0"/>
-          <w:numId w:val="1044"/>
+          <w:numId w:val="1045"/>
         </w:numPr>
       </w:pPr>
       <w:r>
@@ -7411,38 +7897,543 @@
         <w:pStyle w:val="Compact"/>
         <w:numPr>
           <w:ilvl w:val="0"/>
-          <w:numId w:val="1044"/>
-        </w:numPr>
-      </w:pPr>
-      <w:r>
-        <w:rPr>
-          <w:rFonts w:hint="eastAsia"/>
-        </w:rPr>
-        <w:t xml:space="preserve">彈出確認：「確定送出</w:t>
-      </w:r>
-      <w:r>
+          <w:numId w:val="1045"/>
+        </w:numPr>
+      </w:pPr>
+      <w:r>
+        <w:rPr>
+          <w:rFonts w:hint="eastAsia"/>
+          <w:b/>
+          <w:bCs/>
+        </w:rPr>
+        <w:t xml:space="preserve">彈出</w:t>
+      </w:r>
+      <w:r>
+        <w:rPr>
+          <w:b/>
+          <w:bCs/>
+        </w:rPr>
+        <w:t xml:space="preserve"> confirm dialog</w:t>
+      </w:r>
+      <w:r>
+        <w:rPr>
+          <w:rFonts w:hint="eastAsia"/>
+        </w:rPr>
+        <w:t xml:space="preserve">（不是</w:t>
+      </w:r>
+      <w:r>
+        <w:t xml:space="preserve"> native </w:t>
+      </w:r>
+      <w:r>
+        <w:rPr>
+          <w:rFonts w:hint="eastAsia"/>
+        </w:rPr>
+        <w:t xml:space="preserve">prompt）·</w:t>
+      </w:r>
+      <w:r>
+        <w:t xml:space="preserve"> </w:t>
+      </w:r>
+      <w:r>
+        <w:rPr>
+          <w:rFonts w:hint="eastAsia"/>
+        </w:rPr>
+        <w:t xml:space="preserve">內含</w:t>
+      </w:r>
+      <w:r>
+        <w:rPr>
+          <w:rFonts w:hint="eastAsia"/>
+          <w:b/>
+          <w:bCs/>
+        </w:rPr>
+        <w:t xml:space="preserve">完整</w:t>
+      </w:r>
+      <w:r>
+        <w:rPr>
+          <w:b/>
+          <w:bCs/>
+        </w:rPr>
+        <w:t xml:space="preserve"> preview</w:t>
+      </w:r>
+      <w:r>
+        <w:rPr>
+          <w:rFonts w:hint="eastAsia"/>
+        </w:rPr>
+        <w:t xml:space="preserve">：</w:t>
+      </w:r>
+    </w:p>
+    <w:p>
+      <w:pPr>
+        <w:pStyle w:val="SourceCode"/>
+        <w:numPr>
+          <w:ilvl w:val="0"/>
+          <w:numId w:val="1000"/>
+        </w:numPr>
+      </w:pPr>
+      <w:r>
+        <w:rPr>
+          <w:rStyle w:val="VerbatimChar"/>
+          <w:rFonts w:hint="eastAsia"/>
+        </w:rPr>
+        <w:t xml:space="preserve">送出今日日報</w:t>
+      </w:r>
+      <w:r>
+        <w:br/>
+      </w:r>
+      <w:r>
+        <w:rPr>
+          <w:rStyle w:val="VerbatimChar"/>
+          <w:rFonts w:hint="eastAsia"/>
+        </w:rPr>
+        <w:t xml:space="preserve">主管將收到以下</w:t>
+      </w:r>
+      <w:r>
+        <w:rPr>
+          <w:rStyle w:val="VerbatimChar"/>
+        </w:rPr>
         <w:t xml:space="preserve"> 3 </w:t>
       </w:r>
       <w:r>
         <w:rPr>
-          <w:rFonts w:hint="eastAsia"/>
-        </w:rPr>
-        <w:t xml:space="preserve">項給主管？送出後不能再改。」</w:t>
-      </w:r>
-    </w:p>
-    <w:p>
-      <w:pPr>
-        <w:pStyle w:val="Compact"/>
-        <w:numPr>
-          <w:ilvl w:val="0"/>
-          <w:numId w:val="1044"/>
-        </w:numPr>
-      </w:pPr>
-      <w:r>
-        <w:rPr>
-          <w:rFonts w:hint="eastAsia"/>
-        </w:rPr>
-        <w:t xml:space="preserve">按「確定」</w:t>
+          <w:rStyle w:val="VerbatimChar"/>
+          <w:rFonts w:hint="eastAsia"/>
+        </w:rPr>
+        <w:t xml:space="preserve">項</w:t>
+      </w:r>
+      <w:r>
+        <w:rPr>
+          <w:rStyle w:val="VerbatimChar"/>
+        </w:rPr>
+        <w:t xml:space="preserve"> · </w:t>
+      </w:r>
+      <w:r>
+        <w:rPr>
+          <w:rStyle w:val="VerbatimChar"/>
+          <w:rFonts w:hint="eastAsia"/>
+        </w:rPr>
+        <w:t xml:space="preserve">送出後不能再改</w:t>
+      </w:r>
+      <w:r>
+        <w:br/>
+      </w:r>
+      <w:r>
+        <w:br/>
+      </w:r>
+      <w:r>
+        <w:rPr>
+          <w:rStyle w:val="VerbatimChar"/>
+        </w:rPr>
+        <w:t xml:space="preserve">┌────────────────────────────────┐</w:t>
+      </w:r>
+      <w:r>
+        <w:br/>
+      </w:r>
+      <w:r>
+        <w:rPr>
+          <w:rStyle w:val="VerbatimChar"/>
+        </w:rPr>
+        <w:t xml:space="preserve">│ </w:t>
+      </w:r>
+      <w:r>
+        <w:rPr>
+          <w:rStyle w:val="VerbatimChar"/>
+          <w:rFonts w:hint="eastAsia"/>
+        </w:rPr>
+        <w:t xml:space="preserve">王愛麗絲</w:t>
+      </w:r>
+      <w:r>
+        <w:rPr>
+          <w:rStyle w:val="VerbatimChar"/>
+        </w:rPr>
+        <w:t xml:space="preserve"> · </w:t>
+      </w:r>
+      <w:r>
+        <w:rPr>
+          <w:rStyle w:val="VerbatimChar"/>
+          <w:rFonts w:hint="eastAsia"/>
+        </w:rPr>
+        <w:t xml:space="preserve">個人日報</w:t>
+      </w:r>
+      <w:r>
+        <w:rPr>
+          <w:rStyle w:val="VerbatimChar"/>
+        </w:rPr>
+        <w:t xml:space="preserve">            │</w:t>
+      </w:r>
+      <w:r>
+        <w:br/>
+      </w:r>
+      <w:r>
+        <w:rPr>
+          <w:rStyle w:val="VerbatimChar"/>
+        </w:rPr>
+        <w:t xml:space="preserve">│ </w:t>
+      </w:r>
+      <w:r>
+        <w:rPr>
+          <w:rStyle w:val="VerbatimChar"/>
+          <w:rFonts w:hint="eastAsia"/>
+        </w:rPr>
+        <w:t xml:space="preserve">2026-07-23（週四）</w:t>
+      </w:r>
+      <w:r>
+        <w:rPr>
+          <w:rStyle w:val="VerbatimChar"/>
+        </w:rPr>
+        <w:t xml:space="preserve">             │</w:t>
+      </w:r>
+      <w:r>
+        <w:br/>
+      </w:r>
+      <w:r>
+        <w:rPr>
+          <w:rStyle w:val="VerbatimChar"/>
+        </w:rPr>
+        <w:t xml:space="preserve">│ ─────────────                  │</w:t>
+      </w:r>
+      <w:r>
+        <w:br/>
+      </w:r>
+      <w:r>
+        <w:rPr>
+          <w:rStyle w:val="VerbatimChar"/>
+        </w:rPr>
+        <w:t xml:space="preserve">│ 1. A </w:t>
+      </w:r>
+      <w:r>
+        <w:rPr>
+          <w:rStyle w:val="VerbatimChar"/>
+          <w:rFonts w:hint="eastAsia"/>
+        </w:rPr>
+        <w:t xml:space="preserve">客戶</w:t>
+      </w:r>
+      <w:r>
+        <w:rPr>
+          <w:rStyle w:val="VerbatimChar"/>
+        </w:rPr>
+        <w:t xml:space="preserve"> Q3 </w:t>
+      </w:r>
+      <w:r>
+        <w:rPr>
+          <w:rStyle w:val="VerbatimChar"/>
+          <w:rFonts w:hint="eastAsia"/>
+        </w:rPr>
+        <w:t xml:space="preserve">交期</w:t>
+      </w:r>
+      <w:r>
+        <w:rPr>
+          <w:rStyle w:val="VerbatimChar"/>
+        </w:rPr>
+        <w:t xml:space="preserve">  09:00-10:30 │</w:t>
+      </w:r>
+      <w:r>
+        <w:br/>
+      </w:r>
+      <w:r>
+        <w:rPr>
+          <w:rStyle w:val="VerbatimChar"/>
+        </w:rPr>
+        <w:t xml:space="preserve">│    </w:t>
+      </w:r>
+      <w:r>
+        <w:rPr>
+          <w:rStyle w:val="VerbatimChar"/>
+          <w:rFonts w:hint="eastAsia"/>
+        </w:rPr>
+        <w:t xml:space="preserve">客戶要求提早</w:t>
+      </w:r>
+      <w:r>
+        <w:rPr>
+          <w:rStyle w:val="VerbatimChar"/>
+        </w:rPr>
+        <w:t xml:space="preserve"> 15 </w:t>
+      </w:r>
+      <w:r>
+        <w:rPr>
+          <w:rStyle w:val="VerbatimChar"/>
+          <w:rFonts w:hint="eastAsia"/>
+        </w:rPr>
+        <w:t xml:space="preserve">天...</w:t>
+      </w:r>
+      <w:r>
+        <w:rPr>
+          <w:rStyle w:val="VerbatimChar"/>
+        </w:rPr>
+        <w:t xml:space="preserve">        │</w:t>
+      </w:r>
+      <w:r>
+        <w:br/>
+      </w:r>
+      <w:r>
+        <w:rPr>
+          <w:rStyle w:val="VerbatimChar"/>
+        </w:rPr>
+        <w:t xml:space="preserve">│    → </w:t>
+      </w:r>
+      <w:r>
+        <w:rPr>
+          <w:rStyle w:val="VerbatimChar"/>
+          <w:rFonts w:hint="eastAsia"/>
+        </w:rPr>
+        <w:t xml:space="preserve">追蹤</w:t>
+      </w:r>
+      <w:r>
+        <w:rPr>
+          <w:rStyle w:val="VerbatimChar"/>
+        </w:rPr>
+        <w:t xml:space="preserve"> · </w:t>
+      </w:r>
+      <w:r>
+        <w:rPr>
+          <w:rStyle w:val="VerbatimChar"/>
+          <w:rFonts w:hint="eastAsia"/>
+        </w:rPr>
+        <w:t xml:space="preserve">明日</w:t>
+      </w:r>
+      <w:r>
+        <w:rPr>
+          <w:rStyle w:val="VerbatimChar"/>
+        </w:rPr>
+        <w:t xml:space="preserve"> 09:00 </w:t>
+      </w:r>
+      <w:r>
+        <w:rPr>
+          <w:rStyle w:val="VerbatimChar"/>
+          <w:rFonts w:hint="eastAsia"/>
+        </w:rPr>
+        <w:t xml:space="preserve">開會</w:t>
+      </w:r>
+      <w:r>
+        <w:rPr>
+          <w:rStyle w:val="VerbatimChar"/>
+        </w:rPr>
+        <w:t xml:space="preserve">    │</w:t>
+      </w:r>
+      <w:r>
+        <w:br/>
+      </w:r>
+      <w:r>
+        <w:rPr>
+          <w:rStyle w:val="VerbatimChar"/>
+        </w:rPr>
+        <w:t xml:space="preserve">│ 2. </w:t>
+      </w:r>
+      <w:r>
+        <w:rPr>
+          <w:rStyle w:val="VerbatimChar"/>
+          <w:rFonts w:hint="eastAsia"/>
+        </w:rPr>
+        <w:t xml:space="preserve">申請</w:t>
+      </w:r>
+      <w:r>
+        <w:rPr>
+          <w:rStyle w:val="VerbatimChar"/>
+        </w:rPr>
+        <w:t xml:space="preserve"> 2 </w:t>
+      </w:r>
+      <w:r>
+        <w:rPr>
+          <w:rStyle w:val="VerbatimChar"/>
+          <w:rFonts w:hint="eastAsia"/>
+        </w:rPr>
+        <w:t xml:space="preserve">名檢驗</w:t>
+      </w:r>
+      <w:r>
+        <w:rPr>
+          <w:rStyle w:val="VerbatimChar"/>
+        </w:rPr>
+        <w:t xml:space="preserve">   15:00       │</w:t>
+      </w:r>
+      <w:r>
+        <w:br/>
+      </w:r>
+      <w:r>
+        <w:rPr>
+          <w:rStyle w:val="VerbatimChar"/>
+        </w:rPr>
+        <w:t xml:space="preserve">│    </w:t>
+      </w:r>
+      <w:r>
+        <w:rPr>
+          <w:rStyle w:val="VerbatimChar"/>
+          <w:rFonts w:hint="eastAsia"/>
+        </w:rPr>
+        <w:t xml:space="preserve">人資已收單</w:t>
+      </w:r>
+      <w:r>
+        <w:rPr>
+          <w:rStyle w:val="VerbatimChar"/>
+        </w:rPr>
+        <w:t xml:space="preserve"> · </w:t>
+      </w:r>
+      <w:r>
+        <w:rPr>
+          <w:rStyle w:val="VerbatimChar"/>
+          <w:rFonts w:hint="eastAsia"/>
+        </w:rPr>
+        <w:t xml:space="preserve">週五前回</w:t>
+      </w:r>
+      <w:r>
+        <w:rPr>
+          <w:rStyle w:val="VerbatimChar"/>
+        </w:rPr>
+        <w:t xml:space="preserve">        │</w:t>
+      </w:r>
+      <w:r>
+        <w:br/>
+      </w:r>
+      <w:r>
+        <w:rPr>
+          <w:rStyle w:val="VerbatimChar"/>
+        </w:rPr>
+        <w:t xml:space="preserve">│ 3. </w:t>
+      </w:r>
+      <w:r>
+        <w:rPr>
+          <w:rStyle w:val="VerbatimChar"/>
+          <w:rFonts w:hint="eastAsia"/>
+        </w:rPr>
+        <w:t xml:space="preserve">不良品已回工廠</w:t>
+      </w:r>
+      <w:r>
+        <w:rPr>
+          <w:rStyle w:val="VerbatimChar"/>
+        </w:rPr>
+        <w:t xml:space="preserve">              │</w:t>
+      </w:r>
+      <w:r>
+        <w:br/>
+      </w:r>
+      <w:r>
+        <w:rPr>
+          <w:rStyle w:val="VerbatimChar"/>
+        </w:rPr>
+        <w:t xml:space="preserve">│ ─────────────                  │</w:t>
+      </w:r>
+      <w:r>
+        <w:br/>
+      </w:r>
+      <w:r>
+        <w:rPr>
+          <w:rStyle w:val="VerbatimChar"/>
+        </w:rPr>
+        <w:t xml:space="preserve">│ </w:t>
+      </w:r>
+      <w:r>
+        <w:rPr>
+          <w:rStyle w:val="VerbatimChar"/>
+          <w:rFonts w:hint="eastAsia"/>
+        </w:rPr>
+        <w:t xml:space="preserve">共</w:t>
+      </w:r>
+      <w:r>
+        <w:rPr>
+          <w:rStyle w:val="VerbatimChar"/>
+        </w:rPr>
+        <w:t xml:space="preserve"> 3 </w:t>
+      </w:r>
+      <w:r>
+        <w:rPr>
+          <w:rStyle w:val="VerbatimChar"/>
+          <w:rFonts w:hint="eastAsia"/>
+        </w:rPr>
+        <w:t xml:space="preserve">項</w:t>
+      </w:r>
+      <w:r>
+        <w:rPr>
+          <w:rStyle w:val="VerbatimChar"/>
+        </w:rPr>
+        <w:t xml:space="preserve">                        │</w:t>
+      </w:r>
+      <w:r>
+        <w:br/>
+      </w:r>
+      <w:r>
+        <w:rPr>
+          <w:rStyle w:val="VerbatimChar"/>
+        </w:rPr>
+        <w:t xml:space="preserve">└────────────────────────────────┘</w:t>
+      </w:r>
+      <w:r>
+        <w:br/>
+      </w:r>
+      <w:r>
+        <w:br/>
+      </w:r>
+      <w:r>
+        <w:rPr>
+          <w:rStyle w:val="VerbatimChar"/>
+        </w:rPr>
+        <w:t xml:space="preserve">[ </w:t>
+      </w:r>
+      <w:r>
+        <w:rPr>
+          <w:rStyle w:val="VerbatimChar"/>
+          <w:rFonts w:hint="eastAsia"/>
+        </w:rPr>
+        <w:t xml:space="preserve">取消</w:t>
+      </w:r>
+      <w:r>
+        <w:rPr>
+          <w:rStyle w:val="VerbatimChar"/>
+        </w:rPr>
+        <w:t xml:space="preserve"> ]           [ </w:t>
+      </w:r>
+      <w:r>
+        <w:rPr>
+          <w:rStyle w:val="VerbatimChar"/>
+          <w:rFonts w:hint="eastAsia"/>
+        </w:rPr>
+        <w:t xml:space="preserve">確定送出</w:t>
+      </w:r>
+      <w:r>
+        <w:rPr>
+          <w:rStyle w:val="VerbatimChar"/>
+        </w:rPr>
+        <w:t xml:space="preserve"> ]</w:t>
+      </w:r>
+    </w:p>
+    <w:p>
+      <w:pPr>
+        <w:pStyle w:val="Compact"/>
+        <w:numPr>
+          <w:ilvl w:val="0"/>
+          <w:numId w:val="1045"/>
+        </w:numPr>
+      </w:pPr>
+      <w:r>
+        <w:rPr>
+          <w:rFonts w:hint="eastAsia"/>
+        </w:rPr>
+        <w:t xml:space="preserve">確認</w:t>
+      </w:r>
+      <w:r>
+        <w:t xml:space="preserve"> preview </w:t>
+      </w:r>
+      <w:r>
+        <w:rPr>
+          <w:rFonts w:hint="eastAsia"/>
+        </w:rPr>
+        <w:t xml:space="preserve">沒問題</w:t>
+      </w:r>
+      <w:r>
+        <w:t xml:space="preserve"> · </w:t>
+      </w:r>
+      <w:r>
+        <w:rPr>
+          <w:rFonts w:hint="eastAsia"/>
+        </w:rPr>
+        <w:t xml:space="preserve">按「</w:t>
+      </w:r>
+      <w:r>
+        <w:rPr>
+          <w:rFonts w:hint="eastAsia"/>
+          <w:b/>
+          <w:bCs/>
+        </w:rPr>
+        <w:t xml:space="preserve">確定送出</w:t>
+      </w:r>
+      <w:r>
+        <w:t xml:space="preserve">」</w:t>
       </w:r>
     </w:p>
     <w:p>
@@ -7484,17 +8475,110 @@
         <w:pStyle w:val="Compact"/>
         <w:numPr>
           <w:ilvl w:val="0"/>
-          <w:numId w:val="1045"/>
-        </w:numPr>
-      </w:pPr>
-      <w:r>
-        <w:t xml:space="preserve">✅ </w:t>
-      </w:r>
-      <w:r>
-        <w:rPr>
-          <w:rFonts w:hint="eastAsia"/>
-        </w:rPr>
-        <w:t xml:space="preserve">頁面顯「✓</w:t>
+          <w:numId w:val="1046"/>
+        </w:numPr>
+      </w:pPr>
+      <w:r>
+        <w:rPr>
+          <w:rFonts w:hint="eastAsia"/>
+        </w:rPr>
+        <w:t xml:space="preserve">頁面顯「日報已送出</w:t>
+      </w:r>
+      <w:r>
+        <w:t xml:space="preserve"> · </w:t>
+      </w:r>
+      <w:r>
+        <w:rPr>
+          <w:rFonts w:hint="eastAsia"/>
+        </w:rPr>
+        <w:t xml:space="preserve">主管會立即收到</w:t>
+      </w:r>
+      <w:r>
+        <w:t xml:space="preserve"> LINE </w:t>
+      </w:r>
+      <w:r>
+        <w:rPr>
+          <w:rFonts w:hint="eastAsia"/>
+        </w:rPr>
+        <w:t xml:space="preserve">通知」</w:t>
+      </w:r>
+    </w:p>
+    <w:p>
+      <w:pPr>
+        <w:pStyle w:val="Compact"/>
+        <w:numPr>
+          <w:ilvl w:val="0"/>
+          <w:numId w:val="1046"/>
+        </w:numPr>
+      </w:pPr>
+      <w:r>
+        <w:t xml:space="preserve">1 </w:t>
+      </w:r>
+      <w:r>
+        <w:rPr>
+          <w:rFonts w:hint="eastAsia"/>
+        </w:rPr>
+        <w:t xml:space="preserve">秒後</w:t>
+      </w:r>
+      <w:r>
+        <w:t xml:space="preserve"> LIFF </w:t>
+      </w:r>
+      <w:r>
+        <w:rPr>
+          <w:rFonts w:hint="eastAsia"/>
+        </w:rPr>
+        <w:t xml:space="preserve">頁自動關閉</w:t>
+      </w:r>
+      <w:r>
+        <w:t xml:space="preserve"> · </w:t>
+      </w:r>
+      <w:r>
+        <w:rPr>
+          <w:rFonts w:hint="eastAsia"/>
+        </w:rPr>
+        <w:t xml:space="preserve">跳回</w:t>
+      </w:r>
+      <w:r>
+        <w:t xml:space="preserve"> LINE </w:t>
+      </w:r>
+      <w:r>
+        <w:rPr>
+          <w:rFonts w:hint="eastAsia"/>
+        </w:rPr>
+        <w:t xml:space="preserve">聊天</w:t>
+      </w:r>
+    </w:p>
+    <w:p>
+      <w:pPr>
+        <w:pStyle w:val="Compact"/>
+        <w:numPr>
+          <w:ilvl w:val="0"/>
+          <w:numId w:val="1046"/>
+        </w:numPr>
+      </w:pPr>
+      <w:r>
+        <w:rPr>
+          <w:rFonts w:hint="eastAsia"/>
+        </w:rPr>
+        <w:t xml:space="preserve">再打「日報」查</w:t>
+      </w:r>
+      <w:r>
+        <w:t xml:space="preserve"> · </w:t>
+      </w:r>
+      <w:r>
+        <w:rPr>
+          <w:rFonts w:hint="eastAsia"/>
+        </w:rPr>
+        <w:t xml:space="preserve">頂部顯「已於</w:t>
+      </w:r>
+      <w:r>
+        <w:t xml:space="preserve"> XX:XX </w:t>
+      </w:r>
+      <w:r>
+        <w:rPr>
+          <w:rFonts w:hint="eastAsia"/>
+        </w:rPr>
+        <w:t xml:space="preserve">送出主管」·</w:t>
       </w:r>
       <w:r>
         <w:t xml:space="preserve"> </w:t>
@@ -7503,7 +8587,191 @@
         <w:rPr>
           <w:rFonts w:hint="eastAsia"/>
         </w:rPr>
-        <w:t xml:space="preserve">日報已送出</w:t>
+        <w:t xml:space="preserve">按鈕不能再改</w:t>
+      </w:r>
+    </w:p>
+    <w:p>
+      <w:pPr>
+        <w:pStyle w:val="FirstParagraph"/>
+      </w:pPr>
+      <w:r>
+        <w:rPr>
+          <w:rFonts w:hint="eastAsia"/>
+          <w:b/>
+          <w:bCs/>
+        </w:rPr>
+        <w:t xml:space="preserve">應該看到（Alice</w:t>
+      </w:r>
+      <w:r>
+        <w:rPr>
+          <w:b/>
+          <w:bCs/>
+        </w:rPr>
+        <w:t xml:space="preserve"> </w:t>
+      </w:r>
+      <w:r>
+        <w:rPr>
+          <w:rFonts w:hint="eastAsia"/>
+          <w:b/>
+          <w:bCs/>
+        </w:rPr>
+        <w:t xml:space="preserve">部門主管的</w:t>
+      </w:r>
+      <w:r>
+        <w:rPr>
+          <w:b/>
+          <w:bCs/>
+        </w:rPr>
+        <w:t xml:space="preserve"> LINE </w:t>
+      </w:r>
+      <w:r>
+        <w:rPr>
+          <w:rFonts w:hint="eastAsia"/>
+          <w:b/>
+          <w:bCs/>
+        </w:rPr>
+        <w:t xml:space="preserve">端）</w:t>
+      </w:r>
+      <w:r>
+        <w:rPr>
+          <w:rFonts w:hint="eastAsia"/>
+        </w:rPr>
+        <w:t xml:space="preserve">：</w:t>
+      </w:r>
+    </w:p>
+    <w:p>
+      <w:pPr>
+        <w:pStyle w:val="Compact"/>
+        <w:numPr>
+          <w:ilvl w:val="0"/>
+          <w:numId w:val="1047"/>
+        </w:numPr>
+      </w:pPr>
+      <w:r>
+        <w:rPr>
+          <w:rFonts w:hint="eastAsia"/>
+        </w:rPr>
+        <w:t xml:space="preserve">主管</w:t>
+      </w:r>
+      <w:r>
+        <w:t xml:space="preserve"> LINE </w:t>
+      </w:r>
+      <w:r>
+        <w:rPr>
+          <w:rFonts w:hint="eastAsia"/>
+        </w:rPr>
+        <w:t xml:space="preserve">立即收到</w:t>
+      </w:r>
+      <w:r>
+        <w:t xml:space="preserve"> push </w:t>
+      </w:r>
+      <w:r>
+        <w:rPr>
+          <w:rFonts w:hint="eastAsia"/>
+        </w:rPr>
+        <w:t xml:space="preserve">通知：</w:t>
+      </w:r>
+    </w:p>
+    <w:p>
+      <w:pPr>
+        <w:pStyle w:val="SourceCode"/>
+        <w:numPr>
+          <w:ilvl w:val="0"/>
+          <w:numId w:val="1000"/>
+        </w:numPr>
+      </w:pPr>
+      <w:r>
+        <w:rPr>
+          <w:rStyle w:val="VerbatimChar"/>
+          <w:rFonts w:hint="eastAsia"/>
+        </w:rPr>
+        <w:t xml:space="preserve">王愛麗絲</w:t>
+      </w:r>
+      <w:r>
+        <w:rPr>
+          <w:rStyle w:val="VerbatimChar"/>
+        </w:rPr>
+        <w:t xml:space="preserve"> </w:t>
+      </w:r>
+      <w:r>
+        <w:rPr>
+          <w:rStyle w:val="VerbatimChar"/>
+          <w:rFonts w:hint="eastAsia"/>
+        </w:rPr>
+        <w:t xml:space="preserve">已送出</w:t>
+      </w:r>
+      <w:r>
+        <w:rPr>
+          <w:rStyle w:val="VerbatimChar"/>
+        </w:rPr>
+        <w:t xml:space="preserve"> 2026-07-23 </w:t>
+      </w:r>
+      <w:r>
+        <w:rPr>
+          <w:rStyle w:val="VerbatimChar"/>
+          <w:rFonts w:hint="eastAsia"/>
+        </w:rPr>
+        <w:t xml:space="preserve">個人日報</w:t>
+      </w:r>
+      <w:r>
+        <w:rPr>
+          <w:rStyle w:val="VerbatimChar"/>
+        </w:rPr>
+        <w:t xml:space="preserve"> · 3 </w:t>
+      </w:r>
+      <w:r>
+        <w:rPr>
+          <w:rStyle w:val="VerbatimChar"/>
+          <w:rFonts w:hint="eastAsia"/>
+        </w:rPr>
+        <w:t xml:space="preserve">項</w:t>
+      </w:r>
+      <w:r>
+        <w:br/>
+      </w:r>
+      <w:r>
+        <w:rPr>
+          <w:rStyle w:val="VerbatimChar"/>
+          <w:rFonts w:hint="eastAsia"/>
+        </w:rPr>
+        <w:t xml:space="preserve">進「戰情室</w:t>
+      </w:r>
+      <w:r>
+        <w:rPr>
+          <w:rStyle w:val="VerbatimChar"/>
+        </w:rPr>
+        <w:t xml:space="preserve"> → </w:t>
+      </w:r>
+      <w:r>
+        <w:rPr>
+          <w:rStyle w:val="VerbatimChar"/>
+          <w:rFonts w:hint="eastAsia"/>
+        </w:rPr>
+        <w:t xml:space="preserve">部門日報」查看</w:t>
+      </w:r>
+    </w:p>
+    <w:p>
+      <w:pPr>
+        <w:pStyle w:val="Compact"/>
+        <w:numPr>
+          <w:ilvl w:val="0"/>
+          <w:numId w:val="1047"/>
+        </w:numPr>
+      </w:pPr>
+      <w:r>
+        <w:rPr>
+          <w:rFonts w:hint="eastAsia"/>
+        </w:rPr>
+        <w:t xml:space="preserve">主管進</w:t>
+      </w:r>
+      <w:r>
+        <w:t xml:space="preserve"> aiproot </w:t>
+      </w:r>
+      <w:r>
+        <w:rPr>
+          <w:rFonts w:hint="eastAsia"/>
+        </w:rPr>
+        <w:t xml:space="preserve">網頁</w:t>
       </w:r>
       <w:r>
         <w:t xml:space="preserve"> · </w:t>
@@ -7512,43 +8780,16 @@
         <w:rPr>
           <w:rFonts w:hint="eastAsia"/>
         </w:rPr>
-        <w:t xml:space="preserve">主管會立即收到</w:t>
-      </w:r>
-      <w:r>
-        <w:t xml:space="preserve"> LINE </w:t>
-      </w:r>
-      <w:r>
-        <w:rPr>
-          <w:rFonts w:hint="eastAsia"/>
-        </w:rPr>
-        <w:t xml:space="preserve">通知」</w:t>
-      </w:r>
-    </w:p>
-    <w:p>
-      <w:pPr>
-        <w:pStyle w:val="Compact"/>
-        <w:numPr>
-          <w:ilvl w:val="0"/>
-          <w:numId w:val="1045"/>
-        </w:numPr>
-      </w:pPr>
-      <w:r>
-        <w:t xml:space="preserve">✅ 1 </w:t>
-      </w:r>
-      <w:r>
-        <w:rPr>
-          <w:rFonts w:hint="eastAsia"/>
-        </w:rPr>
-        <w:t xml:space="preserve">秒後</w:t>
-      </w:r>
-      <w:r>
-        <w:t xml:space="preserve"> LIFF </w:t>
-      </w:r>
-      <w:r>
-        <w:rPr>
-          <w:rFonts w:hint="eastAsia"/>
-        </w:rPr>
-        <w:t xml:space="preserve">頁自動關閉</w:t>
+        <w:t xml:space="preserve">戰情室</w:t>
+      </w:r>
+      <w:r>
+        <w:t xml:space="preserve"> → </w:t>
+      </w:r>
+      <w:r>
+        <w:rPr>
+          <w:rFonts w:hint="eastAsia"/>
+        </w:rPr>
+        <w:t xml:space="preserve">部門日報</w:t>
       </w:r>
       <w:r>
         <w:t xml:space="preserve"> · </w:t>
@@ -7557,70 +8798,7 @@
         <w:rPr>
           <w:rFonts w:hint="eastAsia"/>
         </w:rPr>
-        <w:t xml:space="preserve">跳回</w:t>
-      </w:r>
-      <w:r>
-        <w:t xml:space="preserve"> LINE </w:t>
-      </w:r>
-      <w:r>
-        <w:rPr>
-          <w:rFonts w:hint="eastAsia"/>
-        </w:rPr>
-        <w:t xml:space="preserve">聊天</w:t>
-      </w:r>
-    </w:p>
-    <w:p>
-      <w:pPr>
-        <w:pStyle w:val="Compact"/>
-        <w:numPr>
-          <w:ilvl w:val="0"/>
-          <w:numId w:val="1045"/>
-        </w:numPr>
-      </w:pPr>
-      <w:r>
-        <w:t xml:space="preserve">✅ </w:t>
-      </w:r>
-      <w:r>
-        <w:rPr>
-          <w:rFonts w:hint="eastAsia"/>
-        </w:rPr>
-        <w:t xml:space="preserve">再打「日報」查</w:t>
-      </w:r>
-      <w:r>
-        <w:t xml:space="preserve"> · </w:t>
-      </w:r>
-      <w:r>
-        <w:rPr>
-          <w:rFonts w:hint="eastAsia"/>
-        </w:rPr>
-        <w:t xml:space="preserve">頂部顯「✓</w:t>
-      </w:r>
-      <w:r>
-        <w:t xml:space="preserve"> </w:t>
-      </w:r>
-      <w:r>
-        <w:rPr>
-          <w:rFonts w:hint="eastAsia"/>
-        </w:rPr>
-        <w:t xml:space="preserve">已於</w:t>
-      </w:r>
-      <w:r>
-        <w:t xml:space="preserve"> XX:XX </w:t>
-      </w:r>
-      <w:r>
-        <w:rPr>
-          <w:rFonts w:hint="eastAsia"/>
-        </w:rPr>
-        <w:t xml:space="preserve">送出主管」·</w:t>
-      </w:r>
-      <w:r>
-        <w:t xml:space="preserve"> </w:t>
-      </w:r>
-      <w:r>
-        <w:rPr>
-          <w:rFonts w:hint="eastAsia"/>
-        </w:rPr>
-        <w:t xml:space="preserve">按鈕不能再改</w:t>
+        <w:t xml:space="preserve">看部門所有員工當日日報</w:t>
       </w:r>
     </w:p>
     <w:p>
@@ -7633,37 +8811,7 @@
           <w:b/>
           <w:bCs/>
         </w:rPr>
-        <w:t xml:space="preserve">應該看到（Alice</w:t>
-      </w:r>
-      <w:r>
-        <w:rPr>
-          <w:b/>
-          <w:bCs/>
-        </w:rPr>
-        <w:t xml:space="preserve"> </w:t>
-      </w:r>
-      <w:r>
-        <w:rPr>
-          <w:rFonts w:hint="eastAsia"/>
-          <w:b/>
-          <w:bCs/>
-        </w:rPr>
-        <w:t xml:space="preserve">部門主管的</w:t>
-      </w:r>
-      <w:r>
-        <w:rPr>
-          <w:b/>
-          <w:bCs/>
-        </w:rPr>
-        <w:t xml:space="preserve"> LINE </w:t>
-      </w:r>
-      <w:r>
-        <w:rPr>
-          <w:rFonts w:hint="eastAsia"/>
-          <w:b/>
-          <w:bCs/>
-        </w:rPr>
-        <w:t xml:space="preserve">端）</w:t>
+        <w:t xml:space="preserve">若主管沒收到通知</w:t>
       </w:r>
       <w:r>
         <w:rPr>
@@ -7677,200 +8825,7 @@
         <w:pStyle w:val="Compact"/>
         <w:numPr>
           <w:ilvl w:val="0"/>
-          <w:numId w:val="1046"/>
-        </w:numPr>
-      </w:pPr>
-      <w:r>
-        <w:t xml:space="preserve">✅ </w:t>
-      </w:r>
-      <w:r>
-        <w:rPr>
-          <w:rFonts w:hint="eastAsia"/>
-        </w:rPr>
-        <w:t xml:space="preserve">主管</w:t>
-      </w:r>
-      <w:r>
-        <w:t xml:space="preserve"> LINE </w:t>
-      </w:r>
-      <w:r>
-        <w:rPr>
-          <w:rFonts w:hint="eastAsia"/>
-        </w:rPr>
-        <w:t xml:space="preserve">立即收到</w:t>
-      </w:r>
-      <w:r>
-        <w:t xml:space="preserve"> push </w:t>
-      </w:r>
-      <w:r>
-        <w:rPr>
-          <w:rFonts w:hint="eastAsia"/>
-        </w:rPr>
-        <w:t xml:space="preserve">通知：</w:t>
-      </w:r>
-    </w:p>
-    <w:p>
-      <w:pPr>
-        <w:pStyle w:val="SourceCode"/>
-        <w:numPr>
-          <w:ilvl w:val="0"/>
-          <w:numId w:val="1000"/>
-        </w:numPr>
-      </w:pPr>
-      <w:r>
-        <w:rPr>
-          <w:rStyle w:val="VerbatimChar"/>
-        </w:rPr>
-        <w:t xml:space="preserve">📋 </w:t>
-      </w:r>
-      <w:r>
-        <w:rPr>
-          <w:rStyle w:val="VerbatimChar"/>
-          <w:rFonts w:hint="eastAsia"/>
-        </w:rPr>
-        <w:t xml:space="preserve">王愛麗絲</w:t>
-      </w:r>
-      <w:r>
-        <w:rPr>
-          <w:rStyle w:val="VerbatimChar"/>
-        </w:rPr>
-        <w:t xml:space="preserve"> </w:t>
-      </w:r>
-      <w:r>
-        <w:rPr>
-          <w:rStyle w:val="VerbatimChar"/>
-          <w:rFonts w:hint="eastAsia"/>
-        </w:rPr>
-        <w:t xml:space="preserve">已送出</w:t>
-      </w:r>
-      <w:r>
-        <w:rPr>
-          <w:rStyle w:val="VerbatimChar"/>
-        </w:rPr>
-        <w:t xml:space="preserve"> 2026-07-23 </w:t>
-      </w:r>
-      <w:r>
-        <w:rPr>
-          <w:rStyle w:val="VerbatimChar"/>
-          <w:rFonts w:hint="eastAsia"/>
-        </w:rPr>
-        <w:t xml:space="preserve">個人日報</w:t>
-      </w:r>
-      <w:r>
-        <w:rPr>
-          <w:rStyle w:val="VerbatimChar"/>
-        </w:rPr>
-        <w:t xml:space="preserve"> · 3 </w:t>
-      </w:r>
-      <w:r>
-        <w:rPr>
-          <w:rStyle w:val="VerbatimChar"/>
-          <w:rFonts w:hint="eastAsia"/>
-        </w:rPr>
-        <w:t xml:space="preserve">項</w:t>
-      </w:r>
-      <w:r>
-        <w:br/>
-      </w:r>
-      <w:r>
-        <w:rPr>
-          <w:rStyle w:val="VerbatimChar"/>
-          <w:rFonts w:hint="eastAsia"/>
-        </w:rPr>
-        <w:t xml:space="preserve">進「戰情室</w:t>
-      </w:r>
-      <w:r>
-        <w:rPr>
-          <w:rStyle w:val="VerbatimChar"/>
-        </w:rPr>
-        <w:t xml:space="preserve"> → </w:t>
-      </w:r>
-      <w:r>
-        <w:rPr>
-          <w:rStyle w:val="VerbatimChar"/>
-          <w:rFonts w:hint="eastAsia"/>
-        </w:rPr>
-        <w:t xml:space="preserve">部門日報」查看</w:t>
-      </w:r>
-    </w:p>
-    <w:p>
-      <w:pPr>
-        <w:pStyle w:val="Compact"/>
-        <w:numPr>
-          <w:ilvl w:val="0"/>
-          <w:numId w:val="1046"/>
-        </w:numPr>
-      </w:pPr>
-      <w:r>
-        <w:t xml:space="preserve">✅ </w:t>
-      </w:r>
-      <w:r>
-        <w:rPr>
-          <w:rFonts w:hint="eastAsia"/>
-        </w:rPr>
-        <w:t xml:space="preserve">主管進</w:t>
-      </w:r>
-      <w:r>
-        <w:t xml:space="preserve"> aiproot </w:t>
-      </w:r>
-      <w:r>
-        <w:rPr>
-          <w:rFonts w:hint="eastAsia"/>
-        </w:rPr>
-        <w:t xml:space="preserve">網頁</w:t>
-      </w:r>
-      <w:r>
-        <w:t xml:space="preserve"> · </w:t>
-      </w:r>
-      <w:r>
-        <w:rPr>
-          <w:rFonts w:hint="eastAsia"/>
-        </w:rPr>
-        <w:t xml:space="preserve">戰情室</w:t>
-      </w:r>
-      <w:r>
-        <w:t xml:space="preserve"> → </w:t>
-      </w:r>
-      <w:r>
-        <w:rPr>
-          <w:rFonts w:hint="eastAsia"/>
-        </w:rPr>
-        <w:t xml:space="preserve">部門日報</w:t>
-      </w:r>
-      <w:r>
-        <w:t xml:space="preserve"> · </w:t>
-      </w:r>
-      <w:r>
-        <w:rPr>
-          <w:rFonts w:hint="eastAsia"/>
-        </w:rPr>
-        <w:t xml:space="preserve">看部門所有員工當日日報</w:t>
-      </w:r>
-    </w:p>
-    <w:p>
-      <w:pPr>
-        <w:pStyle w:val="FirstParagraph"/>
-      </w:pPr>
-      <w:r>
-        <w:rPr>
-          <w:rFonts w:hint="eastAsia"/>
-          <w:b/>
-          <w:bCs/>
-        </w:rPr>
-        <w:t xml:space="preserve">若主管沒收到通知</w:t>
-      </w:r>
-      <w:r>
-        <w:rPr>
-          <w:rFonts w:hint="eastAsia"/>
-        </w:rPr>
-        <w:t xml:space="preserve">：</w:t>
-      </w:r>
-    </w:p>
-    <w:p>
-      <w:pPr>
-        <w:pStyle w:val="Compact"/>
-        <w:numPr>
-          <w:ilvl w:val="0"/>
-          <w:numId w:val="1047"/>
+          <w:numId w:val="1048"/>
         </w:numPr>
       </w:pPr>
       <w:r>
@@ -7897,7 +8852,7 @@
         <w:pStyle w:val="Compact"/>
         <w:numPr>
           <w:ilvl w:val="0"/>
-          <w:numId w:val="1047"/>
+          <w:numId w:val="1048"/>
         </w:numPr>
       </w:pPr>
       <w:r>
@@ -7921,7 +8876,7 @@
         <w:pStyle w:val="Compact"/>
         <w:numPr>
           <w:ilvl w:val="0"/>
-          <w:numId w:val="1047"/>
+          <w:numId w:val="1048"/>
         </w:numPr>
       </w:pPr>
       <w:r>
@@ -8023,7 +8978,7 @@
         <w:pStyle w:val="Compact"/>
         <w:numPr>
           <w:ilvl w:val="0"/>
-          <w:numId w:val="1048"/>
+          <w:numId w:val="1049"/>
         </w:numPr>
       </w:pPr>
       <w:r>
@@ -8065,7 +9020,7 @@
         <w:pStyle w:val="Compact"/>
         <w:numPr>
           <w:ilvl w:val="0"/>
-          <w:numId w:val="1048"/>
+          <w:numId w:val="1049"/>
         </w:numPr>
       </w:pPr>
       <w:r>
@@ -8089,7 +9044,7 @@
         <w:pStyle w:val="Compact"/>
         <w:numPr>
           <w:ilvl w:val="0"/>
-          <w:numId w:val="1048"/>
+          <w:numId w:val="1049"/>
         </w:numPr>
       </w:pPr>
       <w:r>
@@ -8148,7 +9103,7 @@
         <w:pStyle w:val="Compact"/>
         <w:numPr>
           <w:ilvl w:val="0"/>
-          <w:numId w:val="1049"/>
+          <w:numId w:val="1050"/>
         </w:numPr>
       </w:pPr>
       <w:r>
@@ -8210,7 +9165,7 @@
         <w:pStyle w:val="Compact"/>
         <w:numPr>
           <w:ilvl w:val="0"/>
-          <w:numId w:val="1049"/>
+          <w:numId w:val="1050"/>
         </w:numPr>
       </w:pPr>
       <w:r>
@@ -8243,7 +9198,7 @@
         <w:pStyle w:val="Compact"/>
         <w:numPr>
           <w:ilvl w:val="0"/>
-          <w:numId w:val="1049"/>
+          <w:numId w:val="1050"/>
         </w:numPr>
       </w:pPr>
       <w:r>
@@ -8253,36 +9208,241 @@
         <w:t xml:space="preserve">登入後</w:t>
       </w:r>
       <w:r>
-        <w:t xml:space="preserve"> sidebar </w:t>
-      </w:r>
-      <w:r>
-        <w:rPr>
-          <w:rFonts w:hint="eastAsia"/>
-        </w:rPr>
-        <w:t xml:space="preserve">只有「我的日報」（角色是</w:t>
-      </w:r>
-      <w:r>
         <w:t xml:space="preserve"> </w:t>
       </w:r>
       <w:r>
         <w:rPr>
+          <w:b/>
+          <w:bCs/>
+        </w:rPr>
+        <w:t xml:space="preserve">default </w:t>
+      </w:r>
+      <w:r>
+        <w:rPr>
+          <w:rFonts w:hint="eastAsia"/>
+          <w:b/>
+          <w:bCs/>
+        </w:rPr>
+        <w:t xml:space="preserve">直接進「我的日報」</w:t>
+      </w:r>
+      <w:r>
+        <w:rPr>
+          <w:rFonts w:hint="eastAsia"/>
+        </w:rPr>
+        <w:t xml:space="preserve">（role=</w:t>
+      </w:r>
+      <w:r>
+        <w:rPr>
           <w:rStyle w:val="VerbatimChar"/>
         </w:rPr>
         <w:t xml:space="preserve">employee</w:t>
       </w:r>
       <w:r>
-        <w:rPr>
-          <w:rFonts w:hint="eastAsia"/>
-        </w:rPr>
-        <w:t xml:space="preserve">）</w:t>
-      </w:r>
-    </w:p>
-    <w:p>
-      <w:pPr>
-        <w:pStyle w:val="Compact"/>
-        <w:numPr>
-          <w:ilvl w:val="0"/>
-          <w:numId w:val="1049"/>
+        <w:t xml:space="preserve"> </w:t>
+      </w:r>
+      <w:r>
+        <w:t xml:space="preserve">· sidebar </w:t>
+      </w:r>
+      <w:r>
+        <w:rPr>
+          <w:rFonts w:hint="eastAsia"/>
+        </w:rPr>
+        <w:t xml:space="preserve">只有這一項）</w:t>
+      </w:r>
+    </w:p>
+    <w:p>
+      <w:pPr>
+        <w:pStyle w:val="Compact"/>
+        <w:numPr>
+          <w:ilvl w:val="0"/>
+          <w:numId w:val="1050"/>
+        </w:numPr>
+      </w:pPr>
+      <w:r>
+        <w:rPr>
+          <w:rFonts w:hint="eastAsia"/>
+        </w:rPr>
+        <w:t xml:space="preserve">頁面右上有工具列分兩區：</w:t>
+      </w:r>
+    </w:p>
+    <w:p>
+      <w:pPr>
+        <w:pStyle w:val="Compact"/>
+        <w:numPr>
+          <w:ilvl w:val="1"/>
+          <w:numId w:val="1051"/>
+        </w:numPr>
+      </w:pPr>
+      <w:r>
+        <w:rPr>
+          <w:rFonts w:hint="eastAsia"/>
+          <w:b/>
+          <w:bCs/>
+        </w:rPr>
+        <w:t xml:space="preserve">查看日期</w:t>
+      </w:r>
+      <w:r>
+        <w:t xml:space="preserve"> </w:t>
+      </w:r>
+      <w:r>
+        <w:t xml:space="preserve">· date picker · </w:t>
+      </w:r>
+      <w:r>
+        <w:rPr>
+          <w:rFonts w:hint="eastAsia"/>
+        </w:rPr>
+        <w:t xml:space="preserve">可切歷史日看以前送過的日報（hint</w:t>
+      </w:r>
+      <w:r>
+        <w:t xml:space="preserve"> </w:t>
+      </w:r>
+      <w:r>
+        <w:rPr>
+          <w:rFonts w:hint="eastAsia"/>
+        </w:rPr>
+        <w:t xml:space="preserve">顯「今日」/「昨天」/「N</w:t>
+      </w:r>
+      <w:r>
+        <w:t xml:space="preserve"> </w:t>
+      </w:r>
+      <w:r>
+        <w:rPr>
+          <w:rFonts w:hint="eastAsia"/>
+        </w:rPr>
+        <w:t xml:space="preserve">天前」）</w:t>
+      </w:r>
+    </w:p>
+    <w:p>
+      <w:pPr>
+        <w:pStyle w:val="Compact"/>
+        <w:numPr>
+          <w:ilvl w:val="1"/>
+          <w:numId w:val="1051"/>
+        </w:numPr>
+      </w:pPr>
+      <w:r>
+        <w:rPr>
+          <w:rFonts w:hint="eastAsia"/>
+          <w:b/>
+          <w:bCs/>
+        </w:rPr>
+        <w:t xml:space="preserve">當日操作</w:t>
+      </w:r>
+      <w:r>
+        <w:t xml:space="preserve"> </w:t>
+      </w:r>
+      <w:r>
+        <w:t xml:space="preserve">· </w:t>
+      </w:r>
+      <w:r>
+        <w:rPr>
+          <w:rFonts w:hint="eastAsia"/>
+        </w:rPr>
+        <w:t xml:space="preserve">「重新生成」按鈕（hint「重跑</w:t>
+      </w:r>
+      <w:r>
+        <w:t xml:space="preserve"> AI · </w:t>
+      </w:r>
+      <w:r>
+        <w:rPr>
+          <w:rFonts w:hint="eastAsia"/>
+        </w:rPr>
+        <w:t xml:space="preserve">保留手動編輯」）</w:t>
+      </w:r>
+    </w:p>
+    <w:p>
+      <w:pPr>
+        <w:pStyle w:val="Compact"/>
+        <w:numPr>
+          <w:ilvl w:val="0"/>
+          <w:numId w:val="1050"/>
+        </w:numPr>
+      </w:pPr>
+      <w:r>
+        <w:rPr>
+          <w:rFonts w:hint="eastAsia"/>
+        </w:rPr>
+        <w:t xml:space="preserve">編輯區下方</w:t>
+      </w:r>
+      <w:r>
+        <w:rPr>
+          <w:rFonts w:hint="eastAsia"/>
+          <w:b/>
+          <w:bCs/>
+        </w:rPr>
+        <w:t xml:space="preserve">即時</w:t>
+      </w:r>
+      <w:r>
+        <w:rPr>
+          <w:b/>
+          <w:bCs/>
+        </w:rPr>
+        <w:t xml:space="preserve"> preview</w:t>
+      </w:r>
+      <w:r>
+        <w:rPr>
+          <w:rFonts w:hint="eastAsia"/>
+        </w:rPr>
+        <w:t xml:space="preserve">（隨編輯</w:t>
+      </w:r>
+      <w:r>
+        <w:t xml:space="preserve"> live update · </w:t>
+      </w:r>
+      <w:r>
+        <w:rPr>
+          <w:rFonts w:hint="eastAsia"/>
+        </w:rPr>
+        <w:t xml:space="preserve">送出前可看主管將收到的完整格式）</w:t>
+      </w:r>
+    </w:p>
+    <w:p>
+      <w:pPr>
+        <w:pStyle w:val="Compact"/>
+        <w:numPr>
+          <w:ilvl w:val="0"/>
+          <w:numId w:val="1050"/>
+        </w:numPr>
+      </w:pPr>
+      <w:r>
+        <w:rPr>
+          <w:rFonts w:hint="eastAsia"/>
+        </w:rPr>
+        <w:t xml:space="preserve">送「送出日報」→</w:t>
+      </w:r>
+      <w:r>
+        <w:t xml:space="preserve"> dialog </w:t>
+      </w:r>
+      <w:r>
+        <w:rPr>
+          <w:rFonts w:hint="eastAsia"/>
+        </w:rPr>
+        <w:t xml:space="preserve">內同樣</w:t>
+      </w:r>
+      <w:r>
+        <w:t xml:space="preserve"> show </w:t>
+      </w:r>
+      <w:r>
+        <w:rPr>
+          <w:rFonts w:hint="eastAsia"/>
+        </w:rPr>
+        <w:t xml:space="preserve">完整</w:t>
+      </w:r>
+      <w:r>
+        <w:t xml:space="preserve"> preview + </w:t>
+      </w:r>
+      <w:r>
+        <w:rPr>
+          <w:rFonts w:hint="eastAsia"/>
+        </w:rPr>
+        <w:t xml:space="preserve">確定按鈕</w:t>
+      </w:r>
+    </w:p>
+    <w:p>
+      <w:pPr>
+        <w:pStyle w:val="Compact"/>
+        <w:numPr>
+          <w:ilvl w:val="0"/>
+          <w:numId w:val="1050"/>
         </w:numPr>
       </w:pPr>
       <w:r>
@@ -8355,7 +9515,7 @@
         <w:pStyle w:val="Compact"/>
         <w:numPr>
           <w:ilvl w:val="0"/>
-          <w:numId w:val="1050"/>
+          <w:numId w:val="1052"/>
         </w:numPr>
       </w:pPr>
       <w:r>
@@ -8388,7 +9548,7 @@
         <w:pStyle w:val="Compact"/>
         <w:numPr>
           <w:ilvl w:val="0"/>
-          <w:numId w:val="1050"/>
+          <w:numId w:val="1052"/>
         </w:numPr>
       </w:pPr>
       <w:r>
@@ -8430,7 +9590,7 @@
         <w:pStyle w:val="Compact"/>
         <w:numPr>
           <w:ilvl w:val="0"/>
-          <w:numId w:val="1050"/>
+          <w:numId w:val="1052"/>
         </w:numPr>
       </w:pPr>
       <w:r>
@@ -9363,16 +10523,7 @@
               <w:rPr>
                 <w:rFonts w:hint="eastAsia"/>
               </w:rPr>
-              <w:t xml:space="preserve">顯</w:t>
-            </w:r>
-            <w:r>
-              <w:t xml:space="preserve"> AI </w:t>
-            </w:r>
-            <w:r>
-              <w:rPr>
-                <w:rFonts w:hint="eastAsia"/>
-              </w:rPr>
-              <w:t xml:space="preserve">整理</w:t>
+              <w:t xml:space="preserve">顯今日狀態</w:t>
             </w:r>
           </w:p>
         </w:tc>
@@ -9405,7 +10556,7 @@
               <w:pStyle w:val="Compact"/>
             </w:pPr>
             <w:r>
-              <w:t xml:space="preserve">13</w:t>
+              <w:t xml:space="preserve">12a</w:t>
             </w:r>
           </w:p>
         </w:tc>
@@ -9416,16 +10567,309 @@
               <w:pStyle w:val="Compact"/>
             </w:pPr>
             <w:r>
-              <w:t xml:space="preserve">LIFF </w:t>
-            </w:r>
-            <w:r>
               <w:rPr>
                 <w:rFonts w:hint="eastAsia"/>
               </w:rPr>
-              <w:t xml:space="preserve">頁「送出日報」·</w:t>
+              <w:t xml:space="preserve">若</w:t>
+            </w:r>
+            <w:r>
+              <w:t xml:space="preserve"> AI </w:t>
+            </w:r>
+            <w:r>
+              <w:rPr>
+                <w:rFonts w:hint="eastAsia"/>
+              </w:rPr>
+              <w:t xml:space="preserve">尚未整理</w:t>
+            </w:r>
+            <w:r>
+              <w:t xml:space="preserve"> · LIFF </w:t>
+            </w:r>
+            <w:r>
+              <w:rPr>
+                <w:rFonts w:hint="eastAsia"/>
+              </w:rPr>
+              <w:t xml:space="preserve">應顯「已私訊</w:t>
+            </w:r>
+            <w:r>
+              <w:t xml:space="preserve"> N </w:t>
+            </w:r>
+            <w:r>
+              <w:rPr>
+                <w:rFonts w:hint="eastAsia"/>
+              </w:rPr>
+              <w:t xml:space="preserve">則」+</w:t>
             </w:r>
             <w:r>
               <w:t xml:space="preserve"> </w:t>
+            </w:r>
+            <w:r>
+              <w:rPr>
+                <w:rFonts w:hint="eastAsia"/>
+              </w:rPr>
+              <w:t xml:space="preserve">原始訊息</w:t>
+            </w:r>
+            <w:r>
+              <w:t xml:space="preserve"> list</w:t>
+            </w:r>
+          </w:p>
+        </w:tc>
+        <w:tc>
+          <w:tcPr/>
+          <w:p>
+            <w:pPr>
+              <w:pStyle w:val="Compact"/>
+              <w:jc w:val="center"/>
+            </w:pPr>
+            <w:r>
+              <w:t xml:space="preserve">☐</w:t>
+            </w:r>
+          </w:p>
+        </w:tc>
+        <w:tc>
+          <w:tcPr/>
+          <w:p>
+            <w:pPr>
+              <w:pStyle w:val="Compact"/>
+            </w:pPr>
+          </w:p>
+        </w:tc>
+      </w:tr>
+      <w:tr>
+        <w:tc>
+          <w:tcPr/>
+          <w:p>
+            <w:pPr>
+              <w:pStyle w:val="Compact"/>
+            </w:pPr>
+            <w:r>
+              <w:t xml:space="preserve">12b</w:t>
+            </w:r>
+          </w:p>
+        </w:tc>
+        <w:tc>
+          <w:tcPr/>
+          <w:p>
+            <w:pPr>
+              <w:pStyle w:val="Compact"/>
+            </w:pPr>
+            <w:r>
+              <w:rPr>
+                <w:rFonts w:hint="eastAsia"/>
+              </w:rPr>
+              <w:t xml:space="preserve">按「重新生成」·</w:t>
+            </w:r>
+            <w:r>
+              <w:t xml:space="preserve"> 5-10 </w:t>
+            </w:r>
+            <w:r>
+              <w:rPr>
+                <w:rFonts w:hint="eastAsia"/>
+              </w:rPr>
+              <w:t xml:space="preserve">秒後</w:t>
+            </w:r>
+            <w:r>
+              <w:t xml:space="preserve"> AI </w:t>
+            </w:r>
+            <w:r>
+              <w:rPr>
+                <w:rFonts w:hint="eastAsia"/>
+              </w:rPr>
+              <w:t xml:space="preserve">整理完</w:t>
+            </w:r>
+            <w:r>
+              <w:t xml:space="preserve"> · </w:t>
+            </w:r>
+            <w:r>
+              <w:rPr>
+                <w:rFonts w:hint="eastAsia"/>
+              </w:rPr>
+              <w:t xml:space="preserve">頁面</w:t>
+            </w:r>
+            <w:r>
+              <w:t xml:space="preserve"> refresh</w:t>
+            </w:r>
+          </w:p>
+        </w:tc>
+        <w:tc>
+          <w:tcPr/>
+          <w:p>
+            <w:pPr>
+              <w:pStyle w:val="Compact"/>
+              <w:jc w:val="center"/>
+            </w:pPr>
+            <w:r>
+              <w:t xml:space="preserve">☐</w:t>
+            </w:r>
+          </w:p>
+        </w:tc>
+        <w:tc>
+          <w:tcPr/>
+          <w:p>
+            <w:pPr>
+              <w:pStyle w:val="Compact"/>
+            </w:pPr>
+          </w:p>
+        </w:tc>
+      </w:tr>
+      <w:tr>
+        <w:tc>
+          <w:tcPr/>
+          <w:p>
+            <w:pPr>
+              <w:pStyle w:val="Compact"/>
+            </w:pPr>
+            <w:r>
+              <w:t xml:space="preserve">12c</w:t>
+            </w:r>
+          </w:p>
+        </w:tc>
+        <w:tc>
+          <w:tcPr/>
+          <w:p>
+            <w:pPr>
+              <w:pStyle w:val="Compact"/>
+            </w:pPr>
+            <w:r>
+              <w:rPr>
+                <w:rFonts w:hint="eastAsia"/>
+              </w:rPr>
+              <w:t xml:space="preserve">編輯區下方應有「主管將看到</w:t>
+            </w:r>
+            <w:r>
+              <w:t xml:space="preserve"> · </w:t>
+            </w:r>
+            <w:r>
+              <w:rPr>
+                <w:rFonts w:hint="eastAsia"/>
+              </w:rPr>
+              <w:t xml:space="preserve">預覽」live</w:t>
+            </w:r>
+            <w:r>
+              <w:t xml:space="preserve"> preview </w:t>
+            </w:r>
+            <w:r>
+              <w:rPr>
+                <w:rFonts w:hint="eastAsia"/>
+              </w:rPr>
+              <w:t xml:space="preserve">區塊</w:t>
+            </w:r>
+          </w:p>
+        </w:tc>
+        <w:tc>
+          <w:tcPr/>
+          <w:p>
+            <w:pPr>
+              <w:pStyle w:val="Compact"/>
+              <w:jc w:val="center"/>
+            </w:pPr>
+            <w:r>
+              <w:t xml:space="preserve">☐</w:t>
+            </w:r>
+          </w:p>
+        </w:tc>
+        <w:tc>
+          <w:tcPr/>
+          <w:p>
+            <w:pPr>
+              <w:pStyle w:val="Compact"/>
+            </w:pPr>
+          </w:p>
+        </w:tc>
+      </w:tr>
+      <w:tr>
+        <w:tc>
+          <w:tcPr/>
+          <w:p>
+            <w:pPr>
+              <w:pStyle w:val="Compact"/>
+            </w:pPr>
+            <w:r>
+              <w:t xml:space="preserve">13</w:t>
+            </w:r>
+          </w:p>
+        </w:tc>
+        <w:tc>
+          <w:tcPr/>
+          <w:p>
+            <w:pPr>
+              <w:pStyle w:val="Compact"/>
+            </w:pPr>
+            <w:r>
+              <w:rPr>
+                <w:rFonts w:hint="eastAsia"/>
+              </w:rPr>
+              <w:t xml:space="preserve">按「送出日報」·</w:t>
+            </w:r>
+            <w:r>
+              <w:t xml:space="preserve"> </w:t>
+            </w:r>
+            <w:r>
+              <w:rPr>
+                <w:rFonts w:hint="eastAsia"/>
+              </w:rPr>
+              <w:t xml:space="preserve">彈</w:t>
+            </w:r>
+            <w:r>
+              <w:t xml:space="preserve"> confirm dialog </w:t>
+            </w:r>
+            <w:r>
+              <w:rPr>
+                <w:rFonts w:hint="eastAsia"/>
+              </w:rPr>
+              <w:t xml:space="preserve">內含完整</w:t>
+            </w:r>
+            <w:r>
+              <w:t xml:space="preserve"> preview</w:t>
+            </w:r>
+          </w:p>
+        </w:tc>
+        <w:tc>
+          <w:tcPr/>
+          <w:p>
+            <w:pPr>
+              <w:pStyle w:val="Compact"/>
+              <w:jc w:val="center"/>
+            </w:pPr>
+            <w:r>
+              <w:t xml:space="preserve">☐</w:t>
+            </w:r>
+          </w:p>
+        </w:tc>
+        <w:tc>
+          <w:tcPr/>
+          <w:p>
+            <w:pPr>
+              <w:pStyle w:val="Compact"/>
+            </w:pPr>
+          </w:p>
+        </w:tc>
+      </w:tr>
+      <w:tr>
+        <w:tc>
+          <w:tcPr/>
+          <w:p>
+            <w:pPr>
+              <w:pStyle w:val="Compact"/>
+            </w:pPr>
+            <w:r>
+              <w:t xml:space="preserve">13a</w:t>
+            </w:r>
+          </w:p>
+        </w:tc>
+        <w:tc>
+          <w:tcPr/>
+          <w:p>
+            <w:pPr>
+              <w:pStyle w:val="Compact"/>
+            </w:pPr>
+            <w:r>
+              <w:rPr>
+                <w:rFonts w:hint="eastAsia"/>
+              </w:rPr>
+              <w:t xml:space="preserve">確定送出後</w:t>
+            </w:r>
+            <w:r>
+              <w:t xml:space="preserve"> · </w:t>
             </w:r>
             <w:r>
               <w:rPr>
@@ -9440,7 +10884,167 @@
               <w:rPr>
                 <w:rFonts w:hint="eastAsia"/>
               </w:rPr>
-              <w:t xml:space="preserve">立即收通知</w:t>
+              <w:t xml:space="preserve">立即收通知（純文字</w:t>
+            </w:r>
+            <w:r>
+              <w:t xml:space="preserve"> · </w:t>
+            </w:r>
+            <w:r>
+              <w:rPr>
+                <w:rFonts w:hint="eastAsia"/>
+              </w:rPr>
+              <w:t xml:space="preserve">無</w:t>
+            </w:r>
+            <w:r>
+              <w:t xml:space="preserve"> emoji </w:t>
+            </w:r>
+            <w:r>
+              <w:rPr>
+                <w:rFonts w:hint="eastAsia"/>
+              </w:rPr>
+              <w:t xml:space="preserve">開頭）</w:t>
+            </w:r>
+          </w:p>
+        </w:tc>
+        <w:tc>
+          <w:tcPr/>
+          <w:p>
+            <w:pPr>
+              <w:pStyle w:val="Compact"/>
+              <w:jc w:val="center"/>
+            </w:pPr>
+            <w:r>
+              <w:t xml:space="preserve">☐</w:t>
+            </w:r>
+          </w:p>
+        </w:tc>
+        <w:tc>
+          <w:tcPr/>
+          <w:p>
+            <w:pPr>
+              <w:pStyle w:val="Compact"/>
+            </w:pPr>
+          </w:p>
+        </w:tc>
+      </w:tr>
+      <w:tr>
+        <w:tc>
+          <w:tcPr/>
+          <w:p>
+            <w:pPr>
+              <w:pStyle w:val="Compact"/>
+            </w:pPr>
+            <w:r>
+              <w:t xml:space="preserve">14</w:t>
+            </w:r>
+          </w:p>
+        </w:tc>
+        <w:tc>
+          <w:tcPr/>
+          <w:p>
+            <w:pPr>
+              <w:pStyle w:val="Compact"/>
+            </w:pPr>
+            <w:r>
+              <w:rPr>
+                <w:rFonts w:hint="eastAsia"/>
+              </w:rPr>
+              <w:t xml:space="preserve">員工</w:t>
+            </w:r>
+            <w:r>
+              <w:t xml:space="preserve"> web </w:t>
+            </w:r>
+            <w:r>
+              <w:rPr>
+                <w:rFonts w:hint="eastAsia"/>
+              </w:rPr>
+              <w:t xml:space="preserve">登入</w:t>
+            </w:r>
+            <w:r>
+              <w:t xml:space="preserve"> (LINE OAuth) · </w:t>
+            </w:r>
+            <w:r>
+              <w:rPr>
+                <w:rFonts w:hint="eastAsia"/>
+              </w:rPr>
+              <w:t xml:space="preserve">直接進「我的日報」頁</w:t>
+            </w:r>
+            <w:r>
+              <w:t xml:space="preserve"> · sidebar </w:t>
+            </w:r>
+            <w:r>
+              <w:rPr>
+                <w:rFonts w:hint="eastAsia"/>
+              </w:rPr>
+              <w:t xml:space="preserve">只有這項</w:t>
+            </w:r>
+          </w:p>
+        </w:tc>
+        <w:tc>
+          <w:tcPr/>
+          <w:p>
+            <w:pPr>
+              <w:pStyle w:val="Compact"/>
+              <w:jc w:val="center"/>
+            </w:pPr>
+            <w:r>
+              <w:t xml:space="preserve">☐</w:t>
+            </w:r>
+          </w:p>
+        </w:tc>
+        <w:tc>
+          <w:tcPr/>
+          <w:p>
+            <w:pPr>
+              <w:pStyle w:val="Compact"/>
+            </w:pPr>
+          </w:p>
+        </w:tc>
+      </w:tr>
+      <w:tr>
+        <w:tc>
+          <w:tcPr/>
+          <w:p>
+            <w:pPr>
+              <w:pStyle w:val="Compact"/>
+            </w:pPr>
+            <w:r>
+              <w:t xml:space="preserve">15</w:t>
+            </w:r>
+          </w:p>
+        </w:tc>
+        <w:tc>
+          <w:tcPr/>
+          <w:p>
+            <w:pPr>
+              <w:pStyle w:val="Compact"/>
+            </w:pPr>
+            <w:r>
+              <w:t xml:space="preserve">Web </w:t>
+            </w:r>
+            <w:r>
+              <w:rPr>
+                <w:rFonts w:hint="eastAsia"/>
+              </w:rPr>
+              <w:t xml:space="preserve">「我的日報」右上有分兩區工具列（查看日期</w:t>
+            </w:r>
+            <w:r>
+              <w:t xml:space="preserve"> + </w:t>
+            </w:r>
+            <w:r>
+              <w:rPr>
+                <w:rFonts w:hint="eastAsia"/>
+              </w:rPr>
+              <w:t xml:space="preserve">當日操作）·</w:t>
+            </w:r>
+            <w:r>
+              <w:t xml:space="preserve"> </w:t>
+            </w:r>
+            <w:r>
+              <w:rPr>
+                <w:rFonts w:hint="eastAsia"/>
+              </w:rPr>
+              <w:t xml:space="preserve">可切歷史日</w:t>
             </w:r>
           </w:p>
         </w:tc>
@@ -9513,7 +11117,7 @@
         <w:pStyle w:val="Compact"/>
         <w:numPr>
           <w:ilvl w:val="0"/>
-          <w:numId w:val="1051"/>
+          <w:numId w:val="1053"/>
         </w:numPr>
       </w:pPr>
       <w:r>
@@ -9554,7 +11158,7 @@
         <w:pStyle w:val="Compact"/>
         <w:numPr>
           <w:ilvl w:val="0"/>
-          <w:numId w:val="1051"/>
+          <w:numId w:val="1053"/>
         </w:numPr>
       </w:pPr>
       <w:r>
@@ -9604,7 +11208,7 @@
         <w:pStyle w:val="Compact"/>
         <w:numPr>
           <w:ilvl w:val="0"/>
-          <w:numId w:val="1051"/>
+          <w:numId w:val="1053"/>
         </w:numPr>
       </w:pPr>
       <w:r>
@@ -9651,7 +11255,7 @@
         <w:pStyle w:val="Compact"/>
         <w:numPr>
           <w:ilvl w:val="0"/>
-          <w:numId w:val="1051"/>
+          <w:numId w:val="1053"/>
         </w:numPr>
       </w:pPr>
       <w:r>
@@ -10377,7 +11981,7 @@
         <w:pStyle w:val="Compact"/>
         <w:numPr>
           <w:ilvl w:val="0"/>
-          <w:numId w:val="1052"/>
+          <w:numId w:val="1054"/>
         </w:numPr>
       </w:pPr>
       <w:r>
@@ -10401,7 +12005,7 @@
         <w:pStyle w:val="Compact"/>
         <w:numPr>
           <w:ilvl w:val="0"/>
-          <w:numId w:val="1052"/>
+          <w:numId w:val="1054"/>
         </w:numPr>
       </w:pPr>
       <w:r>
@@ -10416,7 +12020,7 @@
         <w:pStyle w:val="Compact"/>
         <w:numPr>
           <w:ilvl w:val="0"/>
-          <w:numId w:val="1052"/>
+          <w:numId w:val="1054"/>
         </w:numPr>
       </w:pPr>
       <w:r>
@@ -10550,7 +12154,7 @@
         <w:pStyle w:val="Compact"/>
         <w:numPr>
           <w:ilvl w:val="0"/>
-          <w:numId w:val="1053"/>
+          <w:numId w:val="1055"/>
         </w:numPr>
       </w:pPr>
       <w:r>
@@ -10583,7 +12187,7 @@
         <w:pStyle w:val="Compact"/>
         <w:numPr>
           <w:ilvl w:val="0"/>
-          <w:numId w:val="1054"/>
+          <w:numId w:val="1056"/>
         </w:numPr>
       </w:pPr>
       <w:r>
@@ -10625,7 +12229,7 @@
         <w:pStyle w:val="Compact"/>
         <w:numPr>
           <w:ilvl w:val="0"/>
-          <w:numId w:val="1055"/>
+          <w:numId w:val="1057"/>
         </w:numPr>
       </w:pPr>
       <w:r>
@@ -11697,6 +13301,9 @@
     <w:abstractNumId w:val="991"/>
   </w:num>
   <w:num w:numId="1044">
+    <w:abstractNumId w:val="991"/>
+  </w:num>
+  <w:num w:numId="1045">
     <w:abstractNumId w:val="99411"/>
     <w:lvlOverride w:ilvl="0">
       <w:startOverride w:val="1"/>
@@ -11726,9 +13333,6 @@
       <w:startOverride w:val="1"/>
     </w:lvlOverride>
   </w:num>
-  <w:num w:numId="1045">
-    <w:abstractNumId w:val="991"/>
-  </w:num>
   <w:num w:numId="1046">
     <w:abstractNumId w:val="991"/>
   </w:num>
@@ -11745,6 +13349,12 @@
     <w:abstractNumId w:val="991"/>
   </w:num>
   <w:num w:numId="1051">
+    <w:abstractNumId w:val="991"/>
+  </w:num>
+  <w:num w:numId="1052">
+    <w:abstractNumId w:val="991"/>
+  </w:num>
+  <w:num w:numId="1053">
     <w:abstractNumId w:val="99411"/>
     <w:lvlOverride w:ilvl="0">
       <w:startOverride w:val="1"/>
@@ -11774,16 +13384,16 @@
       <w:startOverride w:val="1"/>
     </w:lvlOverride>
   </w:num>
-  <w:num w:numId="1052">
+  <w:num w:numId="1054">
     <w:abstractNumId w:val="991"/>
   </w:num>
-  <w:num w:numId="1053">
+  <w:num w:numId="1055">
     <w:abstractNumId w:val="992"/>
   </w:num>
-  <w:num w:numId="1054">
+  <w:num w:numId="1056">
     <w:abstractNumId w:val="992"/>
   </w:num>
-  <w:num w:numId="1055">
+  <w:num w:numId="1057">
     <w:abstractNumId w:val="992"/>
   </w:num>
 </w:numbering>

</xml_diff>